<commit_message>
fix(enrollment): remove configuration field and omit blank configuration rows
</commit_message>
<xml_diff>
--- a/dealer-agreement.docx
+++ b/dealer-agreement.docx
@@ -25,13 +25,10 @@
           <w:i/>
           <w:sz w:val="21"/>
         </w:rPr>
-        <w:t>Ford Engage Program · FE-2026-09-28-review-9</w:t>
+        <w:t>Ford Engage Program · FE-2026-09-28-review-10</w:t>
       </w:r>
     </w:p>
     <w:p>
-      <w:pPr>
-        <w:jc w:val="left"/>
-      </w:pPr>
       <w:r>
         <w:rPr>
           <w:rFonts w:ascii="Georgia" w:hAnsi="Georgia"/>
@@ -181,7 +178,7 @@
           <w:rFonts w:ascii="Georgia" w:hAnsi="Georgia"/>
           <w:sz w:val="21"/>
         </w:rPr>
-        <w:t>(d) eStore. The Company’s dealer-branded OEM parts and accessories eStore, combining catalog discovery, VIN and vehicle fitment, checkout, and order operations. The eStore is a dealer-branded storefront; a widget on the Dealer’s existing website may direct shoppers to it. The Dealer controls storefront pricing and fulfillment within the platform. Specific configuration is identified in the Product Selection block.</w:t>
+        <w:t>(d) eStore. The Company’s dealer-branded OEM parts and accessories eStore, combining catalog discovery, VIN and vehicle fitment, checkout, and order operations. The eStore is a dealer-branded storefront; a widget on the Dealer’s existing website may direct shoppers to it. The Dealer controls storefront pricing and fulfillment within the platform. Specific product selection is identified in the Product Selection block.</w:t>
       </w:r>
     </w:p>
     <w:p>

</xml_diff>

<commit_message>
feat(pricing): additive pricing for all 7 combos, remove custom-quote path, review-11
</commit_message>
<xml_diff>
--- a/dealer-agreement.docx
+++ b/dealer-agreement.docx
@@ -25,7 +25,7 @@
           <w:i/>
           <w:sz w:val="21"/>
         </w:rPr>
-        <w:t>Ford Engage Program · FE-2026-09-28-review-10</w:t>
+        <w:t>Ford Engage Program · FE-2026-09-28-review-11</w:t>
       </w:r>
     </w:p>
     <w:p>
@@ -35,7 +35,7 @@
           <w:b/>
           <w:sz w:val="19"/>
         </w:rPr>
-        <w:t>Pricing plan note: Current agreement §3.1 still permits termination on 30 days' prior written notice. Annual / 24-month pricing-plan treatment on early termination remains pending legal decision; no early-exit fee or noncancelable minimum term is stated here.</w:t>
+        <w:t>Pricing plan note: Current agreement §3.1 still permits termination on 30 days' prior written notice. Annual / 24-month pricing-plan treatment on early termination remains pending legal decision.</w:t>
       </w:r>
     </w:p>
     <w:p>

</xml_diff>